<commit_message>
feat: Add comprehensive English Unit 1 lesson materials, including a lesson plan, presentation, quizzes, handouts, and HTML slides, alongside new Health unit resources and generation scripts.
</commit_message>
<xml_diff>
--- a/Units/English/English Unit 1/Handout_Assessment_AT1-1_PartC.docx
+++ b/Units/English/English Unit 1/Handout_Assessment_AT1-1_PartC.docx
@@ -40,12 +40,6 @@
         <w:gridCol w:w="7516"/>
       </w:tblGrid>
       <w:tr>
-        <w:tblPrEx>
-          <w:tblCellMar>
-            <w:top w:w="0" w:type="dxa"/>
-            <w:bottom w:w="0" w:type="dxa"/>
-          </w:tblCellMar>
-        </w:tblPrEx>
         <w:tc>
           <w:tcPr>
             <w:tcW w:w="1500" w:type="dxa"/>
@@ -213,12 +207,6 @@
         <w:gridCol w:w="6894"/>
       </w:tblGrid>
       <w:tr>
-        <w:tblPrEx>
-          <w:tblCellMar>
-            <w:top w:w="0" w:type="dxa"/>
-            <w:bottom w:w="0" w:type="dxa"/>
-          </w:tblCellMar>
-        </w:tblPrEx>
         <w:tc>
           <w:tcPr>
             <w:tcW w:w="2122" w:type="dxa"/>
@@ -243,12 +231,6 @@
         </w:tc>
       </w:tr>
       <w:tr>
-        <w:tblPrEx>
-          <w:tblCellMar>
-            <w:top w:w="0" w:type="dxa"/>
-            <w:bottom w:w="0" w:type="dxa"/>
-          </w:tblCellMar>
-        </w:tblPrEx>
         <w:tc>
           <w:tcPr>
             <w:tcW w:w="2122" w:type="dxa"/>
@@ -281,12 +263,6 @@
         </w:tc>
       </w:tr>
       <w:tr>
-        <w:tblPrEx>
-          <w:tblCellMar>
-            <w:top w:w="0" w:type="dxa"/>
-            <w:bottom w:w="0" w:type="dxa"/>
-          </w:tblCellMar>
-        </w:tblPrEx>
         <w:tc>
           <w:tcPr>
             <w:tcW w:w="2122" w:type="dxa"/>
@@ -320,12 +296,6 @@
         </w:tc>
       </w:tr>
       <w:tr>
-        <w:tblPrEx>
-          <w:tblCellMar>
-            <w:top w:w="0" w:type="dxa"/>
-            <w:bottom w:w="0" w:type="dxa"/>
-          </w:tblCellMar>
-        </w:tblPrEx>
         <w:tc>
           <w:tcPr>
             <w:tcW w:w="2122" w:type="dxa"/>
@@ -390,12 +360,6 @@
         <w:gridCol w:w="6894"/>
       </w:tblGrid>
       <w:tr>
-        <w:tblPrEx>
-          <w:tblCellMar>
-            <w:top w:w="0" w:type="dxa"/>
-            <w:bottom w:w="0" w:type="dxa"/>
-          </w:tblCellMar>
-        </w:tblPrEx>
         <w:tc>
           <w:tcPr>
             <w:tcW w:w="2122" w:type="dxa"/>
@@ -438,12 +402,6 @@
         </w:tc>
       </w:tr>
       <w:tr>
-        <w:tblPrEx>
-          <w:tblCellMar>
-            <w:top w:w="0" w:type="dxa"/>
-            <w:bottom w:w="0" w:type="dxa"/>
-          </w:tblCellMar>
-        </w:tblPrEx>
         <w:tc>
           <w:tcPr>
             <w:tcW w:w="2122" w:type="dxa"/>
@@ -489,12 +447,6 @@
         </w:tc>
       </w:tr>
       <w:tr>
-        <w:tblPrEx>
-          <w:tblCellMar>
-            <w:top w:w="0" w:type="dxa"/>
-            <w:bottom w:w="0" w:type="dxa"/>
-          </w:tblCellMar>
-        </w:tblPrEx>
         <w:tc>
           <w:tcPr>
             <w:tcW w:w="2122" w:type="dxa"/>

</xml_diff>